<commit_message>
docs: add uml use case diagram
</commit_message>
<xml_diff>
--- a/docs/02-tz.docx
+++ b/docs/02-tz.docx
@@ -37,41 +37,13 @@
           <w:szCs w:val="28"/>
         </w:rPr>
       </w:pPr>
-      <w:proofErr w:type="spellStart"/>
-      <w:r>
-        <w:rPr>
-          <w:rFonts w:ascii="Times New Roman" w:hAnsi="Times New Roman" w:cs="Times New Roman"/>
-          <w:sz w:val="28"/>
-          <w:szCs w:val="28"/>
-        </w:rPr>
-        <w:t>Azimuth</w:t>
-      </w:r>
-      <w:proofErr w:type="spellEnd"/>
-      <w:r>
-        <w:rPr>
-          <w:rFonts w:ascii="Times New Roman" w:hAnsi="Times New Roman" w:cs="Times New Roman"/>
-          <w:sz w:val="28"/>
-          <w:szCs w:val="28"/>
-        </w:rPr>
-        <w:t xml:space="preserve"> — </w:t>
-      </w:r>
-      <w:proofErr w:type="spellStart"/>
-      <w:r>
-        <w:rPr>
-          <w:rFonts w:ascii="Times New Roman" w:hAnsi="Times New Roman" w:cs="Times New Roman"/>
-          <w:sz w:val="28"/>
-          <w:szCs w:val="28"/>
-        </w:rPr>
-        <w:t>Android</w:t>
-      </w:r>
-      <w:proofErr w:type="spellEnd"/>
-      <w:r>
-        <w:rPr>
-          <w:rFonts w:ascii="Times New Roman" w:hAnsi="Times New Roman" w:cs="Times New Roman"/>
-          <w:sz w:val="28"/>
-          <w:szCs w:val="28"/>
-        </w:rPr>
-        <w:t>-приложение для анализа и сравнения стран по показателям, влияющим на условия жизни. Система должна помогать пользователю выбирать подходящие страны для проживания, обучения и удалённой работы на основе его индивидуальных предпочтений.</w:t>
+      <w:r>
+        <w:rPr>
+          <w:rFonts w:ascii="Times New Roman" w:hAnsi="Times New Roman" w:cs="Times New Roman"/>
+          <w:sz w:val="28"/>
+          <w:szCs w:val="28"/>
+        </w:rPr>
+        <w:t>Azimuth — Android-приложение для анализа и сравнения стран по показателям, влияющим на условия жизни. Система должна помогать пользователю выбирать подходящие страны для проживания, обучения и удалённой работы на основе его индивидуальных предпочтений.</w:t>
       </w:r>
     </w:p>
     <w:p>
@@ -469,63 +441,27 @@
           <w:sz w:val="28"/>
           <w:szCs w:val="28"/>
         </w:rPr>
-        <w:t xml:space="preserve">НФТ-5. </w:t>
-      </w:r>
-      <w:proofErr w:type="spellStart"/>
-      <w:r>
-        <w:rPr>
-          <w:rFonts w:ascii="Times New Roman" w:hAnsi="Times New Roman" w:cs="Times New Roman"/>
-          <w:sz w:val="28"/>
-          <w:szCs w:val="28"/>
-        </w:rPr>
-        <w:t>Сопровождаемость</w:t>
-      </w:r>
-      <w:proofErr w:type="spellEnd"/>
-      <w:r>
-        <w:rPr>
-          <w:rFonts w:ascii="Times New Roman" w:hAnsi="Times New Roman" w:cs="Times New Roman"/>
-          <w:sz w:val="28"/>
-          <w:szCs w:val="28"/>
-        </w:rPr>
-        <w:t>. Исходный код должен иметь понятную структуру, разделение ответственности между компонентами и документацию по запуску и настройке.</w:t>
-      </w:r>
-    </w:p>
-    <w:p>
-      <w:pPr>
-        <w:spacing w:after="0" w:line="360" w:lineRule="auto"/>
-        <w:ind w:firstLine="709"/>
-        <w:jc w:val="both"/>
-        <w:rPr>
-          <w:rFonts w:ascii="Times New Roman" w:hAnsi="Times New Roman" w:cs="Times New Roman"/>
-          <w:sz w:val="28"/>
-          <w:szCs w:val="28"/>
-        </w:rPr>
-      </w:pPr>
-      <w:r>
-        <w:rPr>
-          <w:rFonts w:ascii="Times New Roman" w:hAnsi="Times New Roman" w:cs="Times New Roman"/>
-          <w:sz w:val="28"/>
-          <w:szCs w:val="28"/>
-        </w:rPr>
-        <w:t xml:space="preserve">НФТ-6. Совместимость. Приложение должно поддерживать согласованный диапазон версий </w:t>
-      </w:r>
-      <w:proofErr w:type="spellStart"/>
-      <w:r>
-        <w:rPr>
-          <w:rFonts w:ascii="Times New Roman" w:hAnsi="Times New Roman" w:cs="Times New Roman"/>
-          <w:sz w:val="28"/>
-          <w:szCs w:val="28"/>
-        </w:rPr>
-        <w:t>Android</w:t>
-      </w:r>
-      <w:proofErr w:type="spellEnd"/>
-      <w:r>
-        <w:rPr>
-          <w:rFonts w:ascii="Times New Roman" w:hAnsi="Times New Roman" w:cs="Times New Roman"/>
-          <w:sz w:val="28"/>
-          <w:szCs w:val="28"/>
-        </w:rPr>
-        <w:t xml:space="preserve"> и корректно отображаться на устройствах с различными размерами экранов.</w:t>
+        <w:t>НФТ-5. Сопровождаемость. Исходный код должен иметь понятную структуру, разделение ответственности между компонентами и документацию по запуску и настройке.</w:t>
+      </w:r>
+    </w:p>
+    <w:p>
+      <w:pPr>
+        <w:spacing w:after="0" w:line="360" w:lineRule="auto"/>
+        <w:ind w:firstLine="709"/>
+        <w:jc w:val="both"/>
+        <w:rPr>
+          <w:rFonts w:ascii="Times New Roman" w:hAnsi="Times New Roman" w:cs="Times New Roman"/>
+          <w:sz w:val="28"/>
+          <w:szCs w:val="28"/>
+        </w:rPr>
+      </w:pPr>
+      <w:r>
+        <w:rPr>
+          <w:rFonts w:ascii="Times New Roman" w:hAnsi="Times New Roman" w:cs="Times New Roman"/>
+          <w:sz w:val="28"/>
+          <w:szCs w:val="28"/>
+        </w:rPr>
+        <w:t>НФТ-6. Совместимость. Приложение должно поддерживать согласованный диапазон версий Android и корректно отображаться на устройствах с различными размерами экранов.</w:t>
       </w:r>
     </w:p>
     <w:p>
@@ -589,551 +525,563 @@
           <w:sz w:val="28"/>
           <w:szCs w:val="28"/>
         </w:rPr>
-        <w:t xml:space="preserve">4. User </w:t>
-      </w:r>
-      <w:proofErr w:type="spellStart"/>
-      <w:r>
+        <w:t>4. User Stories</w:t>
+      </w:r>
+    </w:p>
+    <w:p>
+      <w:pPr>
+        <w:spacing w:after="0" w:line="360" w:lineRule="auto"/>
+        <w:ind w:firstLine="709"/>
+        <w:jc w:val="both"/>
+        <w:rPr>
+          <w:rFonts w:ascii="Times New Roman" w:hAnsi="Times New Roman" w:cs="Times New Roman"/>
+          <w:sz w:val="28"/>
+          <w:szCs w:val="28"/>
+        </w:rPr>
+      </w:pPr>
+      <w:r>
+        <w:rPr>
+          <w:rFonts w:ascii="Times New Roman" w:hAnsi="Times New Roman" w:cs="Times New Roman"/>
+          <w:sz w:val="28"/>
+          <w:szCs w:val="28"/>
+        </w:rPr>
+        <w:t>US-01</w:t>
+      </w:r>
+      <w:r>
+        <w:rPr>
+          <w:rFonts w:ascii="Times New Roman" w:hAnsi="Times New Roman" w:cs="Times New Roman"/>
+          <w:sz w:val="28"/>
+          <w:szCs w:val="28"/>
+          <w:lang w:val="en-US"/>
+        </w:rPr>
+        <w:t xml:space="preserve"> </w:t>
+      </w:r>
+      <w:r>
+        <w:rPr>
+          <w:rFonts w:ascii="Times New Roman" w:hAnsi="Times New Roman" w:cs="Times New Roman"/>
+          <w:sz w:val="28"/>
+          <w:szCs w:val="28"/>
+        </w:rPr>
+        <w:t>Просмотр стран</w:t>
+      </w:r>
+    </w:p>
+    <w:p>
+      <w:pPr>
+        <w:spacing w:after="0" w:line="360" w:lineRule="auto"/>
+        <w:ind w:firstLine="709"/>
+        <w:jc w:val="both"/>
+        <w:rPr>
+          <w:rFonts w:ascii="Times New Roman" w:hAnsi="Times New Roman" w:cs="Times New Roman"/>
+          <w:sz w:val="28"/>
+          <w:szCs w:val="28"/>
+        </w:rPr>
+      </w:pPr>
+      <w:r>
+        <w:rPr>
+          <w:rFonts w:ascii="Times New Roman" w:hAnsi="Times New Roman" w:cs="Times New Roman"/>
+          <w:sz w:val="28"/>
+          <w:szCs w:val="28"/>
+        </w:rPr>
+        <w:t>Как пользователь, я хочу просматривать каталог стран и искать нужную страну, чтобы быстро находить интересующие меня варианты.</w:t>
+      </w:r>
+    </w:p>
+    <w:p>
+      <w:pPr>
+        <w:spacing w:after="0" w:line="360" w:lineRule="auto"/>
+        <w:ind w:firstLine="709"/>
+        <w:jc w:val="both"/>
+        <w:rPr>
+          <w:rFonts w:ascii="Times New Roman" w:hAnsi="Times New Roman" w:cs="Times New Roman"/>
+          <w:sz w:val="28"/>
+          <w:szCs w:val="28"/>
+        </w:rPr>
+      </w:pPr>
+      <w:r>
+        <w:rPr>
+          <w:rFonts w:ascii="Times New Roman" w:hAnsi="Times New Roman" w:cs="Times New Roman"/>
+          <w:sz w:val="28"/>
+          <w:szCs w:val="28"/>
+        </w:rPr>
+        <w:t>Критерий приёмки: каталог отображает доступные страны, поиск позволяет находить совпадения, а отсутствие результатов сопровождается понятным сообщением.</w:t>
+      </w:r>
+    </w:p>
+    <w:p>
+      <w:pPr>
+        <w:spacing w:after="0" w:line="360" w:lineRule="auto"/>
+        <w:ind w:firstLine="709"/>
+        <w:jc w:val="both"/>
+        <w:rPr>
+          <w:rFonts w:ascii="Times New Roman" w:hAnsi="Times New Roman" w:cs="Times New Roman"/>
+          <w:sz w:val="28"/>
+          <w:szCs w:val="28"/>
+        </w:rPr>
+      </w:pPr>
+      <w:r>
+        <w:rPr>
+          <w:rFonts w:ascii="Times New Roman" w:hAnsi="Times New Roman" w:cs="Times New Roman"/>
+          <w:sz w:val="28"/>
+          <w:szCs w:val="28"/>
+        </w:rPr>
+        <w:t>US-02</w:t>
+      </w:r>
+      <w:r>
+        <w:rPr>
+          <w:rFonts w:ascii="Times New Roman" w:hAnsi="Times New Roman" w:cs="Times New Roman"/>
+          <w:sz w:val="28"/>
+          <w:szCs w:val="28"/>
+          <w:lang w:val="en-US"/>
+        </w:rPr>
+        <w:t xml:space="preserve"> </w:t>
+      </w:r>
+      <w:r>
+        <w:rPr>
+          <w:rFonts w:ascii="Times New Roman" w:hAnsi="Times New Roman" w:cs="Times New Roman"/>
+          <w:sz w:val="28"/>
+          <w:szCs w:val="28"/>
+        </w:rPr>
+        <w:t>Изучение страны</w:t>
+      </w:r>
+    </w:p>
+    <w:p>
+      <w:pPr>
+        <w:spacing w:after="0" w:line="360" w:lineRule="auto"/>
+        <w:ind w:firstLine="709"/>
+        <w:jc w:val="both"/>
+        <w:rPr>
+          <w:rFonts w:ascii="Times New Roman" w:hAnsi="Times New Roman" w:cs="Times New Roman"/>
+          <w:sz w:val="28"/>
+          <w:szCs w:val="28"/>
+        </w:rPr>
+      </w:pPr>
+      <w:r>
+        <w:rPr>
+          <w:rFonts w:ascii="Times New Roman" w:hAnsi="Times New Roman" w:cs="Times New Roman"/>
+          <w:sz w:val="28"/>
+          <w:szCs w:val="28"/>
+        </w:rPr>
+        <w:t>Как пользователь, я хочу видеть основные показатели и историческую динамику страны, чтобы оценивать условия жизни и изменения со временем.</w:t>
+      </w:r>
+    </w:p>
+    <w:p>
+      <w:pPr>
+        <w:spacing w:after="0" w:line="360" w:lineRule="auto"/>
+        <w:ind w:firstLine="709"/>
+        <w:jc w:val="both"/>
+        <w:rPr>
+          <w:rFonts w:ascii="Times New Roman" w:hAnsi="Times New Roman" w:cs="Times New Roman"/>
+          <w:sz w:val="28"/>
+          <w:szCs w:val="28"/>
+        </w:rPr>
+      </w:pPr>
+      <w:r>
+        <w:rPr>
+          <w:rFonts w:ascii="Times New Roman" w:hAnsi="Times New Roman" w:cs="Times New Roman"/>
+          <w:sz w:val="28"/>
+          <w:szCs w:val="28"/>
+        </w:rPr>
+        <w:t>Критерий приёмки: карточка отображает доступные показатели, графики строятся при наличии достаточных данных, а отсутствующая информация обозначается явно.</w:t>
+      </w:r>
+    </w:p>
+    <w:p>
+      <w:pPr>
+        <w:spacing w:after="0" w:line="360" w:lineRule="auto"/>
+        <w:ind w:firstLine="709"/>
+        <w:jc w:val="both"/>
+        <w:rPr>
+          <w:rFonts w:ascii="Times New Roman" w:hAnsi="Times New Roman" w:cs="Times New Roman"/>
+          <w:sz w:val="28"/>
+          <w:szCs w:val="28"/>
+        </w:rPr>
+      </w:pPr>
+      <w:r>
+        <w:rPr>
+          <w:rFonts w:ascii="Times New Roman" w:hAnsi="Times New Roman" w:cs="Times New Roman"/>
+          <w:sz w:val="28"/>
+          <w:szCs w:val="28"/>
+        </w:rPr>
+        <w:lastRenderedPageBreak/>
+        <w:t>US-03</w:t>
+      </w:r>
+      <w:r>
+        <w:rPr>
+          <w:rFonts w:ascii="Times New Roman" w:hAnsi="Times New Roman" w:cs="Times New Roman"/>
+          <w:sz w:val="28"/>
+          <w:szCs w:val="28"/>
+          <w:lang w:val="en-US"/>
+        </w:rPr>
+        <w:t xml:space="preserve"> </w:t>
+      </w:r>
+      <w:r>
+        <w:rPr>
+          <w:rFonts w:ascii="Times New Roman" w:hAnsi="Times New Roman" w:cs="Times New Roman"/>
+          <w:sz w:val="28"/>
+          <w:szCs w:val="28"/>
+        </w:rPr>
+        <w:t>Сравнение стран</w:t>
+      </w:r>
+    </w:p>
+    <w:p>
+      <w:pPr>
+        <w:spacing w:after="0" w:line="360" w:lineRule="auto"/>
+        <w:ind w:firstLine="709"/>
+        <w:jc w:val="both"/>
+        <w:rPr>
+          <w:rFonts w:ascii="Times New Roman" w:hAnsi="Times New Roman" w:cs="Times New Roman"/>
+          <w:sz w:val="28"/>
+          <w:szCs w:val="28"/>
+        </w:rPr>
+      </w:pPr>
+      <w:r>
+        <w:rPr>
+          <w:rFonts w:ascii="Times New Roman" w:hAnsi="Times New Roman" w:cs="Times New Roman"/>
+          <w:sz w:val="28"/>
+          <w:szCs w:val="28"/>
+        </w:rPr>
+        <w:t>Как пользователь, я хочу сравнивать несколько стран по одинаковым критериям, чтобы выявлять их преимущества и недостатки.</w:t>
+      </w:r>
+    </w:p>
+    <w:p>
+      <w:pPr>
+        <w:spacing w:after="0" w:line="360" w:lineRule="auto"/>
+        <w:ind w:firstLine="709"/>
+        <w:jc w:val="both"/>
+        <w:rPr>
+          <w:rFonts w:ascii="Times New Roman" w:hAnsi="Times New Roman" w:cs="Times New Roman"/>
+          <w:sz w:val="28"/>
+          <w:szCs w:val="28"/>
+        </w:rPr>
+      </w:pPr>
+      <w:r>
+        <w:rPr>
+          <w:rFonts w:ascii="Times New Roman" w:hAnsi="Times New Roman" w:cs="Times New Roman"/>
+          <w:sz w:val="28"/>
+          <w:szCs w:val="28"/>
+        </w:rPr>
+        <w:t>Критерий приёмки: выбранные страны отображаются в едином формате, а показатели можно сопоставить между собой.</w:t>
+      </w:r>
+    </w:p>
+    <w:p>
+      <w:pPr>
+        <w:spacing w:after="0" w:line="360" w:lineRule="auto"/>
+        <w:ind w:firstLine="709"/>
+        <w:jc w:val="both"/>
+        <w:rPr>
+          <w:rFonts w:ascii="Times New Roman" w:hAnsi="Times New Roman" w:cs="Times New Roman"/>
+          <w:sz w:val="28"/>
+          <w:szCs w:val="28"/>
+        </w:rPr>
+      </w:pPr>
+      <w:r>
+        <w:rPr>
+          <w:rFonts w:ascii="Times New Roman" w:hAnsi="Times New Roman" w:cs="Times New Roman"/>
+          <w:sz w:val="28"/>
+          <w:szCs w:val="28"/>
+        </w:rPr>
+        <w:t>US-04</w:t>
+      </w:r>
+      <w:r>
+        <w:rPr>
+          <w:rFonts w:ascii="Times New Roman" w:hAnsi="Times New Roman" w:cs="Times New Roman"/>
+          <w:sz w:val="28"/>
+          <w:szCs w:val="28"/>
+          <w:lang w:val="en-US"/>
+        </w:rPr>
+        <w:t xml:space="preserve"> </w:t>
+      </w:r>
+      <w:r>
+        <w:rPr>
+          <w:rFonts w:ascii="Times New Roman" w:hAnsi="Times New Roman" w:cs="Times New Roman"/>
+          <w:sz w:val="28"/>
+          <w:szCs w:val="28"/>
+        </w:rPr>
+        <w:t>Получение рекомендаций</w:t>
+      </w:r>
+    </w:p>
+    <w:p>
+      <w:pPr>
+        <w:spacing w:after="0" w:line="360" w:lineRule="auto"/>
+        <w:ind w:firstLine="709"/>
+        <w:jc w:val="both"/>
+        <w:rPr>
+          <w:rFonts w:ascii="Times New Roman" w:hAnsi="Times New Roman" w:cs="Times New Roman"/>
+          <w:sz w:val="28"/>
+          <w:szCs w:val="28"/>
+        </w:rPr>
+      </w:pPr>
+      <w:r>
+        <w:rPr>
+          <w:rFonts w:ascii="Times New Roman" w:hAnsi="Times New Roman" w:cs="Times New Roman"/>
+          <w:sz w:val="28"/>
+          <w:szCs w:val="28"/>
+        </w:rPr>
+        <w:t>Как пользователь, я хочу указывать важность различных критериев, чтобы получать рейтинг стран, соответствующих моим предпочтениям.</w:t>
+      </w:r>
+    </w:p>
+    <w:p>
+      <w:pPr>
+        <w:spacing w:after="0" w:line="360" w:lineRule="auto"/>
+        <w:ind w:firstLine="709"/>
+        <w:jc w:val="both"/>
+        <w:rPr>
+          <w:rFonts w:ascii="Times New Roman" w:hAnsi="Times New Roman" w:cs="Times New Roman"/>
+          <w:sz w:val="28"/>
+          <w:szCs w:val="28"/>
+        </w:rPr>
+      </w:pPr>
+      <w:r>
+        <w:rPr>
+          <w:rFonts w:ascii="Times New Roman" w:hAnsi="Times New Roman" w:cs="Times New Roman"/>
+          <w:sz w:val="28"/>
+          <w:szCs w:val="28"/>
+        </w:rPr>
+        <w:t>Критерий приёмки: система принимает предпочтения, формирует упорядоченный список и позволяет понять, какие критерии повлияли на результат.</w:t>
+      </w:r>
+    </w:p>
+    <w:p>
+      <w:pPr>
+        <w:spacing w:after="0" w:line="360" w:lineRule="auto"/>
+        <w:ind w:firstLine="709"/>
+        <w:jc w:val="both"/>
+        <w:rPr>
+          <w:rFonts w:ascii="Times New Roman" w:hAnsi="Times New Roman" w:cs="Times New Roman"/>
+          <w:sz w:val="28"/>
+          <w:szCs w:val="28"/>
+        </w:rPr>
+      </w:pPr>
+      <w:r>
+        <w:rPr>
+          <w:rFonts w:ascii="Times New Roman" w:hAnsi="Times New Roman" w:cs="Times New Roman"/>
+          <w:sz w:val="28"/>
+          <w:szCs w:val="28"/>
+        </w:rPr>
+        <w:t>US-05</w:t>
+      </w:r>
+      <w:r>
+        <w:rPr>
+          <w:rFonts w:ascii="Times New Roman" w:hAnsi="Times New Roman" w:cs="Times New Roman"/>
+          <w:sz w:val="28"/>
+          <w:szCs w:val="28"/>
+          <w:lang w:val="en-US"/>
+        </w:rPr>
+        <w:t xml:space="preserve"> </w:t>
+      </w:r>
+      <w:r>
+        <w:rPr>
+          <w:rFonts w:ascii="Times New Roman" w:hAnsi="Times New Roman" w:cs="Times New Roman"/>
+          <w:sz w:val="28"/>
+          <w:szCs w:val="28"/>
+        </w:rPr>
+        <w:t>Сохранение избранного</w:t>
+      </w:r>
+    </w:p>
+    <w:p>
+      <w:pPr>
+        <w:spacing w:after="0" w:line="360" w:lineRule="auto"/>
+        <w:ind w:firstLine="709"/>
+        <w:jc w:val="both"/>
+        <w:rPr>
+          <w:rFonts w:ascii="Times New Roman" w:hAnsi="Times New Roman" w:cs="Times New Roman"/>
+          <w:sz w:val="28"/>
+          <w:szCs w:val="28"/>
+        </w:rPr>
+      </w:pPr>
+      <w:r>
+        <w:rPr>
+          <w:rFonts w:ascii="Times New Roman" w:hAnsi="Times New Roman" w:cs="Times New Roman"/>
+          <w:sz w:val="28"/>
+          <w:szCs w:val="28"/>
+        </w:rPr>
+        <w:t>Как пользователь, я хочу сохранять интересующие меня страны, чтобы возвращаться к ним без повторного поиска.</w:t>
+      </w:r>
+    </w:p>
+    <w:p>
+      <w:pPr>
+        <w:spacing w:after="0" w:line="360" w:lineRule="auto"/>
+        <w:ind w:firstLine="709"/>
+        <w:jc w:val="both"/>
+        <w:rPr>
+          <w:rFonts w:ascii="Times New Roman" w:hAnsi="Times New Roman" w:cs="Times New Roman"/>
+          <w:sz w:val="28"/>
+          <w:szCs w:val="28"/>
+        </w:rPr>
+      </w:pPr>
+      <w:r>
+        <w:rPr>
+          <w:rFonts w:ascii="Times New Roman" w:hAnsi="Times New Roman" w:cs="Times New Roman"/>
+          <w:sz w:val="28"/>
+          <w:szCs w:val="28"/>
+        </w:rPr>
+        <w:t>Критерий приёмки: пользователь может добавлять и удалять страны из избранного, а список сохраняется согласно принятому способу локального или серверного хранения.</w:t>
+      </w:r>
+    </w:p>
+    <w:p>
+      <w:pPr>
+        <w:spacing w:after="0" w:line="360" w:lineRule="auto"/>
+        <w:ind w:firstLine="709"/>
+        <w:jc w:val="both"/>
+        <w:rPr>
+          <w:rFonts w:ascii="Times New Roman" w:hAnsi="Times New Roman" w:cs="Times New Roman"/>
+          <w:sz w:val="28"/>
+          <w:szCs w:val="28"/>
+        </w:rPr>
+      </w:pPr>
+      <w:r>
+        <w:rPr>
+          <w:rFonts w:ascii="Times New Roman" w:hAnsi="Times New Roman" w:cs="Times New Roman"/>
+          <w:sz w:val="28"/>
+          <w:szCs w:val="28"/>
+        </w:rPr>
+        <w:t>US-06</w:t>
+      </w:r>
+      <w:r>
+        <w:rPr>
+          <w:rFonts w:ascii="Times New Roman" w:hAnsi="Times New Roman" w:cs="Times New Roman"/>
+          <w:sz w:val="28"/>
+          <w:szCs w:val="28"/>
+          <w:lang w:val="en-US"/>
+        </w:rPr>
+        <w:t xml:space="preserve"> </w:t>
+      </w:r>
+      <w:r>
+        <w:rPr>
+          <w:rFonts w:ascii="Times New Roman" w:hAnsi="Times New Roman" w:cs="Times New Roman"/>
+          <w:sz w:val="28"/>
+          <w:szCs w:val="28"/>
+        </w:rPr>
+        <w:t>Использование геолокации</w:t>
+      </w:r>
+    </w:p>
+    <w:p>
+      <w:pPr>
+        <w:spacing w:after="0" w:line="360" w:lineRule="auto"/>
+        <w:ind w:firstLine="709"/>
+        <w:jc w:val="both"/>
+        <w:rPr>
+          <w:rFonts w:ascii="Times New Roman" w:hAnsi="Times New Roman" w:cs="Times New Roman"/>
+          <w:sz w:val="28"/>
+          <w:szCs w:val="28"/>
+        </w:rPr>
+      </w:pPr>
+      <w:r>
+        <w:rPr>
+          <w:rFonts w:ascii="Times New Roman" w:hAnsi="Times New Roman" w:cs="Times New Roman"/>
+          <w:sz w:val="28"/>
+          <w:szCs w:val="28"/>
+        </w:rPr>
+        <w:t>Как пользователь, я хочу при необходимости разрешить определение своего местоположения, чтобы использовать функции, учитывающие текущую географическую позицию.</w:t>
+      </w:r>
+    </w:p>
+    <w:p>
+      <w:pPr>
+        <w:spacing w:after="0" w:line="360" w:lineRule="auto"/>
+        <w:ind w:firstLine="709"/>
+        <w:jc w:val="both"/>
+        <w:rPr>
+          <w:rFonts w:ascii="Times New Roman" w:hAnsi="Times New Roman" w:cs="Times New Roman"/>
+          <w:sz w:val="28"/>
+          <w:szCs w:val="28"/>
+        </w:rPr>
+      </w:pPr>
+      <w:r>
+        <w:rPr>
+          <w:rFonts w:ascii="Times New Roman" w:hAnsi="Times New Roman" w:cs="Times New Roman"/>
+          <w:sz w:val="28"/>
+          <w:szCs w:val="28"/>
+        </w:rPr>
+        <w:t>Критерий приёмки: приложение запрашивает разрешение, корректно обрабатывает отказ и сохраняет работоспособность основных функций.</w:t>
+      </w:r>
+    </w:p>
+    <w:p>
+      <w:pPr>
+        <w:spacing w:after="0" w:line="360" w:lineRule="auto"/>
+        <w:ind w:firstLine="709"/>
+        <w:jc w:val="both"/>
         <w:rPr>
           <w:rFonts w:ascii="Times New Roman" w:hAnsi="Times New Roman" w:cs="Times New Roman"/>
           <w:b/>
           <w:bCs/>
           <w:sz w:val="28"/>
           <w:szCs w:val="28"/>
-        </w:rPr>
-        <w:t>Stories</w:t>
-      </w:r>
-      <w:proofErr w:type="spellEnd"/>
-    </w:p>
-    <w:p>
-      <w:pPr>
-        <w:spacing w:after="0" w:line="360" w:lineRule="auto"/>
-        <w:ind w:firstLine="709"/>
-        <w:jc w:val="both"/>
-        <w:rPr>
-          <w:rFonts w:ascii="Times New Roman" w:hAnsi="Times New Roman" w:cs="Times New Roman"/>
-          <w:sz w:val="28"/>
-          <w:szCs w:val="28"/>
-        </w:rPr>
-      </w:pPr>
-      <w:r>
-        <w:rPr>
-          <w:rFonts w:ascii="Times New Roman" w:hAnsi="Times New Roman" w:cs="Times New Roman"/>
-          <w:sz w:val="28"/>
-          <w:szCs w:val="28"/>
-        </w:rPr>
-        <w:t>US-01</w:t>
-      </w:r>
-      <w:r>
-        <w:rPr>
-          <w:rFonts w:ascii="Times New Roman" w:hAnsi="Times New Roman" w:cs="Times New Roman"/>
-          <w:sz w:val="28"/>
-          <w:szCs w:val="28"/>
           <w:lang w:val="en-US"/>
         </w:rPr>
-        <w:t xml:space="preserve"> </w:t>
-      </w:r>
-      <w:r>
-        <w:rPr>
-          <w:rFonts w:ascii="Times New Roman" w:hAnsi="Times New Roman" w:cs="Times New Roman"/>
-          <w:sz w:val="28"/>
-          <w:szCs w:val="28"/>
-        </w:rPr>
-        <w:t>Просмотр стран</w:t>
-      </w:r>
-    </w:p>
-    <w:p>
-      <w:pPr>
-        <w:spacing w:after="0" w:line="360" w:lineRule="auto"/>
-        <w:ind w:firstLine="709"/>
-        <w:jc w:val="both"/>
-        <w:rPr>
-          <w:rFonts w:ascii="Times New Roman" w:hAnsi="Times New Roman" w:cs="Times New Roman"/>
-          <w:sz w:val="28"/>
-          <w:szCs w:val="28"/>
-        </w:rPr>
-      </w:pPr>
-      <w:r>
-        <w:rPr>
-          <w:rFonts w:ascii="Times New Roman" w:hAnsi="Times New Roman" w:cs="Times New Roman"/>
-          <w:sz w:val="28"/>
-          <w:szCs w:val="28"/>
-        </w:rPr>
-        <w:t>Как пользователь, я хочу просматривать каталог стран и искать нужную страну, чтобы быстро находить интересующие меня варианты.</w:t>
-      </w:r>
-    </w:p>
-    <w:p>
-      <w:pPr>
-        <w:spacing w:after="0" w:line="360" w:lineRule="auto"/>
-        <w:ind w:firstLine="709"/>
-        <w:jc w:val="both"/>
-        <w:rPr>
-          <w:rFonts w:ascii="Times New Roman" w:hAnsi="Times New Roman" w:cs="Times New Roman"/>
-          <w:sz w:val="28"/>
-          <w:szCs w:val="28"/>
-        </w:rPr>
-      </w:pPr>
-      <w:r>
-        <w:rPr>
-          <w:rFonts w:ascii="Times New Roman" w:hAnsi="Times New Roman" w:cs="Times New Roman"/>
-          <w:sz w:val="28"/>
-          <w:szCs w:val="28"/>
-        </w:rPr>
-        <w:t>Критерий приёмки: каталог отображает доступные страны, поиск позволяет находить совпадения, а отсутствие результатов сопровождается понятным сообщением.</w:t>
-      </w:r>
-    </w:p>
-    <w:p>
-      <w:pPr>
-        <w:spacing w:after="0" w:line="360" w:lineRule="auto"/>
-        <w:ind w:firstLine="709"/>
-        <w:jc w:val="both"/>
-        <w:rPr>
-          <w:rFonts w:ascii="Times New Roman" w:hAnsi="Times New Roman" w:cs="Times New Roman"/>
-          <w:sz w:val="28"/>
-          <w:szCs w:val="28"/>
-        </w:rPr>
-      </w:pPr>
-      <w:r>
-        <w:rPr>
-          <w:rFonts w:ascii="Times New Roman" w:hAnsi="Times New Roman" w:cs="Times New Roman"/>
-          <w:sz w:val="28"/>
-          <w:szCs w:val="28"/>
-        </w:rPr>
-        <w:t>US-02</w:t>
-      </w:r>
-      <w:r>
-        <w:rPr>
-          <w:rFonts w:ascii="Times New Roman" w:hAnsi="Times New Roman" w:cs="Times New Roman"/>
-          <w:sz w:val="28"/>
-          <w:szCs w:val="28"/>
-          <w:lang w:val="en-US"/>
-        </w:rPr>
-        <w:t xml:space="preserve"> </w:t>
-      </w:r>
-      <w:r>
-        <w:rPr>
-          <w:rFonts w:ascii="Times New Roman" w:hAnsi="Times New Roman" w:cs="Times New Roman"/>
-          <w:sz w:val="28"/>
-          <w:szCs w:val="28"/>
-        </w:rPr>
-        <w:t>Изучение страны</w:t>
-      </w:r>
-    </w:p>
-    <w:p>
-      <w:pPr>
-        <w:spacing w:after="0" w:line="360" w:lineRule="auto"/>
-        <w:ind w:firstLine="709"/>
-        <w:jc w:val="both"/>
-        <w:rPr>
-          <w:rFonts w:ascii="Times New Roman" w:hAnsi="Times New Roman" w:cs="Times New Roman"/>
-          <w:sz w:val="28"/>
-          <w:szCs w:val="28"/>
-        </w:rPr>
-      </w:pPr>
-      <w:r>
-        <w:rPr>
-          <w:rFonts w:ascii="Times New Roman" w:hAnsi="Times New Roman" w:cs="Times New Roman"/>
-          <w:sz w:val="28"/>
-          <w:szCs w:val="28"/>
-        </w:rPr>
-        <w:t>Как пользователь, я хочу видеть основные показатели и историческую динамику страны, чтобы оценивать условия жизни и изменения со временем.</w:t>
-      </w:r>
-    </w:p>
-    <w:p>
-      <w:pPr>
-        <w:spacing w:after="0" w:line="360" w:lineRule="auto"/>
-        <w:ind w:firstLine="709"/>
-        <w:jc w:val="both"/>
-        <w:rPr>
-          <w:rFonts w:ascii="Times New Roman" w:hAnsi="Times New Roman" w:cs="Times New Roman"/>
-          <w:sz w:val="28"/>
-          <w:szCs w:val="28"/>
-        </w:rPr>
-      </w:pPr>
-      <w:r>
-        <w:rPr>
-          <w:rFonts w:ascii="Times New Roman" w:hAnsi="Times New Roman" w:cs="Times New Roman"/>
-          <w:sz w:val="28"/>
-          <w:szCs w:val="28"/>
-        </w:rPr>
-        <w:t>Критерий приёмки: карточка отображает доступные показатели, графики строятся при наличии достаточных данных, а отсутствующая информация обозначается явно.</w:t>
-      </w:r>
-    </w:p>
-    <w:p>
-      <w:pPr>
-        <w:spacing w:after="0" w:line="360" w:lineRule="auto"/>
-        <w:ind w:firstLine="709"/>
-        <w:jc w:val="both"/>
-        <w:rPr>
-          <w:rFonts w:ascii="Times New Roman" w:hAnsi="Times New Roman" w:cs="Times New Roman"/>
-          <w:sz w:val="28"/>
-          <w:szCs w:val="28"/>
-        </w:rPr>
-      </w:pPr>
-      <w:r>
-        <w:rPr>
-          <w:rFonts w:ascii="Times New Roman" w:hAnsi="Times New Roman" w:cs="Times New Roman"/>
-          <w:sz w:val="28"/>
-          <w:szCs w:val="28"/>
-        </w:rPr>
-        <w:lastRenderedPageBreak/>
-        <w:t>US-03</w:t>
-      </w:r>
-      <w:r>
-        <w:rPr>
-          <w:rFonts w:ascii="Times New Roman" w:hAnsi="Times New Roman" w:cs="Times New Roman"/>
-          <w:sz w:val="28"/>
-          <w:szCs w:val="28"/>
-          <w:lang w:val="en-US"/>
-        </w:rPr>
-        <w:t xml:space="preserve"> </w:t>
-      </w:r>
-      <w:r>
-        <w:rPr>
-          <w:rFonts w:ascii="Times New Roman" w:hAnsi="Times New Roman" w:cs="Times New Roman"/>
-          <w:sz w:val="28"/>
-          <w:szCs w:val="28"/>
-        </w:rPr>
-        <w:t>Сравнение стран</w:t>
-      </w:r>
-    </w:p>
-    <w:p>
-      <w:pPr>
-        <w:spacing w:after="0" w:line="360" w:lineRule="auto"/>
-        <w:ind w:firstLine="709"/>
-        <w:jc w:val="both"/>
-        <w:rPr>
-          <w:rFonts w:ascii="Times New Roman" w:hAnsi="Times New Roman" w:cs="Times New Roman"/>
-          <w:sz w:val="28"/>
-          <w:szCs w:val="28"/>
-        </w:rPr>
-      </w:pPr>
-      <w:r>
-        <w:rPr>
-          <w:rFonts w:ascii="Times New Roman" w:hAnsi="Times New Roman" w:cs="Times New Roman"/>
-          <w:sz w:val="28"/>
-          <w:szCs w:val="28"/>
-        </w:rPr>
-        <w:t>Как пользователь, я хочу сравнивать несколько стран по одинаковым критериям, чтобы выявлять их преимущества и недостатки.</w:t>
-      </w:r>
-    </w:p>
-    <w:p>
-      <w:pPr>
-        <w:spacing w:after="0" w:line="360" w:lineRule="auto"/>
-        <w:ind w:firstLine="709"/>
-        <w:jc w:val="both"/>
-        <w:rPr>
-          <w:rFonts w:ascii="Times New Roman" w:hAnsi="Times New Roman" w:cs="Times New Roman"/>
-          <w:sz w:val="28"/>
-          <w:szCs w:val="28"/>
-        </w:rPr>
-      </w:pPr>
-      <w:r>
-        <w:rPr>
-          <w:rFonts w:ascii="Times New Roman" w:hAnsi="Times New Roman" w:cs="Times New Roman"/>
-          <w:sz w:val="28"/>
-          <w:szCs w:val="28"/>
-        </w:rPr>
-        <w:t>Критерий приёмки: выбранные страны отображаются в едином формате, а показатели можно сопоставить между собой.</w:t>
-      </w:r>
-    </w:p>
-    <w:p>
-      <w:pPr>
-        <w:spacing w:after="0" w:line="360" w:lineRule="auto"/>
-        <w:ind w:firstLine="709"/>
-        <w:jc w:val="both"/>
-        <w:rPr>
-          <w:rFonts w:ascii="Times New Roman" w:hAnsi="Times New Roman" w:cs="Times New Roman"/>
-          <w:sz w:val="28"/>
-          <w:szCs w:val="28"/>
-        </w:rPr>
-      </w:pPr>
-      <w:r>
-        <w:rPr>
-          <w:rFonts w:ascii="Times New Roman" w:hAnsi="Times New Roman" w:cs="Times New Roman"/>
-          <w:sz w:val="28"/>
-          <w:szCs w:val="28"/>
-        </w:rPr>
-        <w:t>US-04</w:t>
-      </w:r>
-      <w:r>
-        <w:rPr>
-          <w:rFonts w:ascii="Times New Roman" w:hAnsi="Times New Roman" w:cs="Times New Roman"/>
-          <w:sz w:val="28"/>
-          <w:szCs w:val="28"/>
-          <w:lang w:val="en-US"/>
-        </w:rPr>
-        <w:t xml:space="preserve"> </w:t>
-      </w:r>
-      <w:r>
-        <w:rPr>
-          <w:rFonts w:ascii="Times New Roman" w:hAnsi="Times New Roman" w:cs="Times New Roman"/>
-          <w:sz w:val="28"/>
-          <w:szCs w:val="28"/>
-        </w:rPr>
-        <w:t>Получение рекомендаций</w:t>
-      </w:r>
-    </w:p>
-    <w:p>
-      <w:pPr>
-        <w:spacing w:after="0" w:line="360" w:lineRule="auto"/>
-        <w:ind w:firstLine="709"/>
-        <w:jc w:val="both"/>
-        <w:rPr>
-          <w:rFonts w:ascii="Times New Roman" w:hAnsi="Times New Roman" w:cs="Times New Roman"/>
-          <w:sz w:val="28"/>
-          <w:szCs w:val="28"/>
-        </w:rPr>
-      </w:pPr>
-      <w:r>
-        <w:rPr>
-          <w:rFonts w:ascii="Times New Roman" w:hAnsi="Times New Roman" w:cs="Times New Roman"/>
-          <w:sz w:val="28"/>
-          <w:szCs w:val="28"/>
-        </w:rPr>
-        <w:t>Как пользователь, я хочу указывать важность различных критериев, чтобы получать рейтинг стран, соответствующих моим предпочтениям.</w:t>
-      </w:r>
-    </w:p>
-    <w:p>
-      <w:pPr>
-        <w:spacing w:after="0" w:line="360" w:lineRule="auto"/>
-        <w:ind w:firstLine="709"/>
-        <w:jc w:val="both"/>
-        <w:rPr>
-          <w:rFonts w:ascii="Times New Roman" w:hAnsi="Times New Roman" w:cs="Times New Roman"/>
-          <w:sz w:val="28"/>
-          <w:szCs w:val="28"/>
-        </w:rPr>
-      </w:pPr>
-      <w:r>
-        <w:rPr>
-          <w:rFonts w:ascii="Times New Roman" w:hAnsi="Times New Roman" w:cs="Times New Roman"/>
-          <w:sz w:val="28"/>
-          <w:szCs w:val="28"/>
-        </w:rPr>
-        <w:t>Критерий приёмки: система принимает предпочтения, формирует упорядоченный список и позволяет понять, какие критерии повлияли на результат.</w:t>
-      </w:r>
-    </w:p>
-    <w:p>
-      <w:pPr>
-        <w:spacing w:after="0" w:line="360" w:lineRule="auto"/>
-        <w:ind w:firstLine="709"/>
-        <w:jc w:val="both"/>
-        <w:rPr>
-          <w:rFonts w:ascii="Times New Roman" w:hAnsi="Times New Roman" w:cs="Times New Roman"/>
-          <w:sz w:val="28"/>
-          <w:szCs w:val="28"/>
-        </w:rPr>
-      </w:pPr>
-      <w:r>
-        <w:rPr>
-          <w:rFonts w:ascii="Times New Roman" w:hAnsi="Times New Roman" w:cs="Times New Roman"/>
-          <w:sz w:val="28"/>
-          <w:szCs w:val="28"/>
-        </w:rPr>
-        <w:t>US-05</w:t>
-      </w:r>
-      <w:r>
-        <w:rPr>
-          <w:rFonts w:ascii="Times New Roman" w:hAnsi="Times New Roman" w:cs="Times New Roman"/>
-          <w:sz w:val="28"/>
-          <w:szCs w:val="28"/>
-          <w:lang w:val="en-US"/>
-        </w:rPr>
-        <w:t xml:space="preserve"> </w:t>
-      </w:r>
-      <w:r>
-        <w:rPr>
-          <w:rFonts w:ascii="Times New Roman" w:hAnsi="Times New Roman" w:cs="Times New Roman"/>
-          <w:sz w:val="28"/>
-          <w:szCs w:val="28"/>
-        </w:rPr>
-        <w:t>Сохранение избранного</w:t>
-      </w:r>
-    </w:p>
-    <w:p>
-      <w:pPr>
-        <w:spacing w:after="0" w:line="360" w:lineRule="auto"/>
-        <w:ind w:firstLine="709"/>
-        <w:jc w:val="both"/>
-        <w:rPr>
-          <w:rFonts w:ascii="Times New Roman" w:hAnsi="Times New Roman" w:cs="Times New Roman"/>
-          <w:sz w:val="28"/>
-          <w:szCs w:val="28"/>
-        </w:rPr>
-      </w:pPr>
-      <w:r>
-        <w:rPr>
-          <w:rFonts w:ascii="Times New Roman" w:hAnsi="Times New Roman" w:cs="Times New Roman"/>
-          <w:sz w:val="28"/>
-          <w:szCs w:val="28"/>
-        </w:rPr>
-        <w:t>Как пользователь, я хочу сохранять интересующие меня страны, чтобы возвращаться к ним без повторного поиска.</w:t>
-      </w:r>
-    </w:p>
-    <w:p>
-      <w:pPr>
-        <w:spacing w:after="0" w:line="360" w:lineRule="auto"/>
-        <w:ind w:firstLine="709"/>
-        <w:jc w:val="both"/>
-        <w:rPr>
-          <w:rFonts w:ascii="Times New Roman" w:hAnsi="Times New Roman" w:cs="Times New Roman"/>
-          <w:sz w:val="28"/>
-          <w:szCs w:val="28"/>
-        </w:rPr>
-      </w:pPr>
-      <w:r>
-        <w:rPr>
-          <w:rFonts w:ascii="Times New Roman" w:hAnsi="Times New Roman" w:cs="Times New Roman"/>
-          <w:sz w:val="28"/>
-          <w:szCs w:val="28"/>
-        </w:rPr>
-        <w:t>Критерий приёмки: пользователь может добавлять и удалять страны из избранного, а список сохраняется согласно принятому способу локального или серверного хранения.</w:t>
-      </w:r>
-    </w:p>
-    <w:p>
-      <w:pPr>
-        <w:spacing w:after="0" w:line="360" w:lineRule="auto"/>
-        <w:ind w:firstLine="709"/>
-        <w:jc w:val="both"/>
-        <w:rPr>
-          <w:rFonts w:ascii="Times New Roman" w:hAnsi="Times New Roman" w:cs="Times New Roman"/>
-          <w:sz w:val="28"/>
-          <w:szCs w:val="28"/>
-        </w:rPr>
-      </w:pPr>
-      <w:r>
-        <w:rPr>
-          <w:rFonts w:ascii="Times New Roman" w:hAnsi="Times New Roman" w:cs="Times New Roman"/>
-          <w:sz w:val="28"/>
-          <w:szCs w:val="28"/>
-        </w:rPr>
-        <w:t>US-06</w:t>
-      </w:r>
-      <w:r>
-        <w:rPr>
-          <w:rFonts w:ascii="Times New Roman" w:hAnsi="Times New Roman" w:cs="Times New Roman"/>
-          <w:sz w:val="28"/>
-          <w:szCs w:val="28"/>
-          <w:lang w:val="en-US"/>
-        </w:rPr>
-        <w:t xml:space="preserve"> </w:t>
-      </w:r>
-      <w:r>
-        <w:rPr>
-          <w:rFonts w:ascii="Times New Roman" w:hAnsi="Times New Roman" w:cs="Times New Roman"/>
-          <w:sz w:val="28"/>
-          <w:szCs w:val="28"/>
-        </w:rPr>
-        <w:t>Использование геолокации</w:t>
-      </w:r>
-    </w:p>
-    <w:p>
-      <w:pPr>
-        <w:spacing w:after="0" w:line="360" w:lineRule="auto"/>
-        <w:ind w:firstLine="709"/>
-        <w:jc w:val="both"/>
-        <w:rPr>
-          <w:rFonts w:ascii="Times New Roman" w:hAnsi="Times New Roman" w:cs="Times New Roman"/>
-          <w:sz w:val="28"/>
-          <w:szCs w:val="28"/>
-        </w:rPr>
-      </w:pPr>
-      <w:r>
-        <w:rPr>
-          <w:rFonts w:ascii="Times New Roman" w:hAnsi="Times New Roman" w:cs="Times New Roman"/>
-          <w:sz w:val="28"/>
-          <w:szCs w:val="28"/>
-        </w:rPr>
-        <w:t>Как пользователь, я хочу при необходимости разрешить определение своего местоположения, чтобы использовать функции, учитывающие текущую географическую позицию.</w:t>
-      </w:r>
-    </w:p>
-    <w:p>
-      <w:pPr>
-        <w:spacing w:after="0" w:line="360" w:lineRule="auto"/>
-        <w:ind w:firstLine="709"/>
-        <w:jc w:val="both"/>
-        <w:rPr>
-          <w:rFonts w:ascii="Times New Roman" w:hAnsi="Times New Roman" w:cs="Times New Roman"/>
-          <w:sz w:val="28"/>
-          <w:szCs w:val="28"/>
-        </w:rPr>
-      </w:pPr>
-      <w:r>
-        <w:rPr>
-          <w:rFonts w:ascii="Times New Roman" w:hAnsi="Times New Roman" w:cs="Times New Roman"/>
-          <w:sz w:val="28"/>
-          <w:szCs w:val="28"/>
-        </w:rPr>
-        <w:t>Критерий приёмки: приложение запрашивает разрешение, корректно обрабатывает отказ и сохраняет работоспособность основных функций.</w:t>
-      </w:r>
-    </w:p>
-    <w:p>
-      <w:pPr>
-        <w:spacing w:after="0" w:line="360" w:lineRule="auto"/>
-        <w:ind w:firstLine="709"/>
-        <w:jc w:val="both"/>
+      </w:pPr>
+      <w:r>
         <w:rPr>
           <w:rFonts w:ascii="Times New Roman" w:hAnsi="Times New Roman" w:cs="Times New Roman"/>
           <w:b/>
           <w:bCs/>
           <w:sz w:val="28"/>
           <w:szCs w:val="28"/>
-          <w:lang w:val="en-US"/>
-        </w:rPr>
-      </w:pPr>
-      <w:r>
+        </w:rPr>
+        <w:t>5. Use-case-диаграмма</w:t>
+      </w:r>
+    </w:p>
+    <w:p>
+      <w:pPr>
+        <w:spacing w:after="0" w:line="360" w:lineRule="auto"/>
+        <w:jc w:val="center"/>
         <w:rPr>
           <w:rFonts w:ascii="Times New Roman" w:hAnsi="Times New Roman" w:cs="Times New Roman"/>
           <w:b/>
           <w:bCs/>
           <w:sz w:val="28"/>
           <w:szCs w:val="28"/>
-        </w:rPr>
-        <w:t xml:space="preserve">5. </w:t>
-      </w:r>
-      <w:proofErr w:type="spellStart"/>
-      <w:r>
-        <w:rPr>
-          <w:rFonts w:ascii="Times New Roman" w:hAnsi="Times New Roman" w:cs="Times New Roman"/>
-          <w:b/>
-          <w:bCs/>
-          <w:sz w:val="28"/>
-          <w:szCs w:val="28"/>
-        </w:rPr>
-        <w:t>Use</w:t>
-      </w:r>
-      <w:proofErr w:type="spellEnd"/>
-      <w:r>
-        <w:rPr>
-          <w:rFonts w:ascii="Times New Roman" w:hAnsi="Times New Roman" w:cs="Times New Roman"/>
-          <w:b/>
-          <w:bCs/>
-          <w:sz w:val="28"/>
-          <w:szCs w:val="28"/>
-        </w:rPr>
-        <w:t>-</w:t>
-      </w:r>
-      <w:proofErr w:type="spellStart"/>
-      <w:r>
-        <w:rPr>
-          <w:rFonts w:ascii="Times New Roman" w:hAnsi="Times New Roman" w:cs="Times New Roman"/>
-          <w:b/>
-          <w:bCs/>
-          <w:sz w:val="28"/>
-          <w:szCs w:val="28"/>
-        </w:rPr>
-        <w:t>case</w:t>
-      </w:r>
-      <w:proofErr w:type="spellEnd"/>
-      <w:r>
-        <w:rPr>
-          <w:rFonts w:ascii="Times New Roman" w:hAnsi="Times New Roman" w:cs="Times New Roman"/>
-          <w:b/>
-          <w:bCs/>
-          <w:sz w:val="28"/>
-          <w:szCs w:val="28"/>
-        </w:rPr>
-        <w:t>-диаграмма</w:t>
+          <w:lang w:val="en-US"/>
+        </w:rPr>
+      </w:pPr>
+      <w:r>
+        <w:rPr>
+          <w:noProof/>
+        </w:rPr>
+        <w:lastRenderedPageBreak/>
+        <w:drawing>
+          <wp:inline distT="0" distB="0" distL="0" distR="0" wp14:anchorId="7AABB40A" wp14:editId="1D3BDDC0">
+            <wp:extent cx="5940425" cy="3959225"/>
+            <wp:effectExtent l="0" t="0" r="3175" b="3175"/>
+            <wp:docPr id="1" name="Рисунок 1"/>
+            <wp:cNvGraphicFramePr>
+              <a:graphicFrameLocks xmlns:a="http://schemas.openxmlformats.org/drawingml/2006/main" noChangeAspect="1"/>
+            </wp:cNvGraphicFramePr>
+            <a:graphic xmlns:a="http://schemas.openxmlformats.org/drawingml/2006/main">
+              <a:graphicData uri="http://schemas.openxmlformats.org/drawingml/2006/picture">
+                <pic:pic xmlns:pic="http://schemas.openxmlformats.org/drawingml/2006/picture">
+                  <pic:nvPicPr>
+                    <pic:cNvPr id="0" name="Picture 1"/>
+                    <pic:cNvPicPr>
+                      <a:picLocks noChangeAspect="1" noChangeArrowheads="1"/>
+                    </pic:cNvPicPr>
+                  </pic:nvPicPr>
+                  <pic:blipFill>
+                    <a:blip r:embed="rId4" cstate="print">
+                      <a:extLst>
+                        <a:ext uri="{28A0092B-C50C-407E-A947-70E740481C1C}">
+                          <a14:useLocalDpi xmlns:a14="http://schemas.microsoft.com/office/drawing/2010/main" val="0"/>
+                        </a:ext>
+                      </a:extLst>
+                    </a:blip>
+                    <a:srcRect/>
+                    <a:stretch>
+                      <a:fillRect/>
+                    </a:stretch>
+                  </pic:blipFill>
+                  <pic:spPr bwMode="auto">
+                    <a:xfrm>
+                      <a:off x="0" y="0"/>
+                      <a:ext cx="5940425" cy="3959225"/>
+                    </a:xfrm>
+                    <a:prstGeom prst="rect">
+                      <a:avLst/>
+                    </a:prstGeom>
+                    <a:noFill/>
+                    <a:ln>
+                      <a:noFill/>
+                    </a:ln>
+                  </pic:spPr>
+                </pic:pic>
+              </a:graphicData>
+            </a:graphic>
+          </wp:inline>
+        </w:drawing>
       </w:r>
     </w:p>
     <w:sectPr>
@@ -1749,6 +1697,7 @@
   <w:style w:type="character" w:default="1" w:styleId="a0">
     <w:name w:val="Default Paragraph Font"/>
     <w:uiPriority w:val="1"/>
+    <w:semiHidden/>
     <w:unhideWhenUsed/>
   </w:style>
   <w:style w:type="table" w:default="1" w:styleId="a1">

</xml_diff>